<commit_message>
§11.4.65 export-sync: regenerate governance render-twins for §11.4.237 + commit reproducible render pipeline
The .html/.docx/.pdf twins were stale (missing §11.4.237). Added scripts/render/render-governance-twins.sh + assets (template reproduces the operator <head>+OpenDesign styling byte-for-byte; gfm reader matches heading-IDs/colgroup/smart) and regenerated all 15 twins deterministically (SOURCE_DATE_EPOCH pinned). §11.4.237 now present in every render; §11.4.236 preserved. Sole deviation from pre-2026-08-07 renders: a non-standard "→&quot; post-step (no pandoc flag produces it) is not replicated — renders identically. Forensics: _tests/evidence/render58/ANALYSIS.md (umbrella).

Co-Authored-By: Claude Opus 4.8 (1M context) <noreply@anthropic.com>
</commit_message>
<xml_diff>
--- a/CLAUDE.docx
+++ b/CLAUDE.docx
@@ -2,14 +2,6 @@
 <file path=word/document.xml><?xml version="1.0" encoding="utf-8"?>
 <w:document xmlns:w="http://schemas.openxmlformats.org/wordprocessingml/2006/main" xmlns:m="http://schemas.openxmlformats.org/officeDocument/2006/math" xmlns:r="http://schemas.openxmlformats.org/officeDocument/2006/relationships" xmlns:o="urn:schemas-microsoft-com:office:office" xmlns:v="urn:schemas-microsoft-com:vml" xmlns:w10="urn:schemas-microsoft-com:office:word" xmlns:a="http://schemas.openxmlformats.org/drawingml/2006/main" xmlns:pic="http://schemas.openxmlformats.org/drawingml/2006/picture" xmlns:wp="http://schemas.openxmlformats.org/drawingml/2006/wordprocessingDrawing">
   <w:body>
-    <w:p>
-      <w:pPr>
-        <w:pStyle w:val="Title"/>
-      </w:pPr>
-      <w:r>
-        <w:t xml:space="preserve">CLAUDE</w:t>
-      </w:r>
-    </w:p>
     <w:bookmarkStart w:id="122" w:name="helix-constitution--universal-claudemd"/>
     <w:p>
       <w:pPr>
@@ -171,7 +163,7 @@
               <w:pStyle w:val="Compact"/>
             </w:pPr>
             <w:r>
-              <w:t xml:space="preserve">Amendment of 2026-07-26 — NEW universal anchor §11.4.234 (operator mandate 2026-07-26, verbatim: "We MUST have dedicated script to run hook validations, and commit and push mechanism ALWAYS unblocked!"): hook validations run as an EXPLICIT stage of a dedicated, idempotent commit/push script (consumer-bound path as DATA per §11.4.35 — Lava binding: scripts/commit-push-all.sh); automatic git hooks wired via core.hooksPath MUST NOT gate routine commit/push (disconnect = hooksPath unset, hook file preserved UNMODIFIED, --no-verify never the routine path); NO gate is lost (every disconnected check remains executed at a named script stage or release/tag gate, silently dropping one is a §11.4 PASS-bluff at the process layer); the commit/push mechanism is ALWAYS unblocked (failing validation = clear per-check report + documented remediation path, long multi-minute gates separable from cheap checks and skippable ONLY via an explicit recorded deferral flag — Lava binding: LAVA_SYNC_SKIP_CI=1 — never an opaque hung/rejected push). Classification: universal (§11.4.17). Propagation gate CM-COVENANT-114-234-PROPAGATION + recommended mechanism gates CM-DEDICATED-HOOK-VALIDATION-SCRIPT / CM-HOOKS-NEVER-BLOCK-PUSH / CM-NO-GATE-LOST-ON-HOOK-DISCONNECT / CM-COMMIT-PUSH-ALWAYS-UNBLOCKED + paired §1.1 mutations (gate-code = separate work item, NOT claimed shipped §11.4.6/§11.4.227). Amendment region byte-identical across all 5 governance files (md5-verified); §11.4.234 exactly-once block-start per file (§11.4.227(B)), no anchor-number collision. CLAUDE.md + AGENTS.md + QWEN.md + GEMINI.md mirrors updated in lockstep (§11.4.157). Generated .html/.pdf/.docx twins NOT regenerated (exporter still not a runnable in-repo script — honestly STALE per §11.4.106(E)). Prior round: Amendment of 2026-07-26 — the EFFORT-tiering + 5-field-label batch (operator IMPORTANT mandate 2026-07-26, verbatim: "Besides dynamic determining proper models to use, we MUST decide the effort as well and switch between the effort settings same as we do now for chosen model! Labeling MUST BE extended for this details as well. Example: (T1/main - claude4 - opus - high)."). §11.4.182 EXTENSION amended (in-place, no re-mint): the work-stream label form extends from</w:t>
+              <w:t xml:space="preserve">Amendment of 2026-08-05 — NEW universal anchor §11.4.237 (operator mandate 2026-08-05): every translation / translated artifact (UI strings, pages, documents, PDFs, any localized content) MUST undergo a HEAVY, EXHAUSTIVE, INDEPENDENT context-and-spirit-aware review by a reviewer STRUCTURALLY SEPARATE from the translator (never self-review — §11.4.92 precedes, §11.4.142 never satisfies); the reviewer holds + applies (a) full CONTEXT of the source material (original ideas / subject-domain / purpose / audience), (b) the SPIRIT / idiom / register / tradition / cultural-conventions of the TARGET language so the result reads NATIVE + natural + maximally polished, never literal/word-for-word/calqued, and (c) correct TECHNICAL vocabulary + VERBATIM preservation of NON-TRANSLATABLE terms (product/brand/proper names, technology/library/API names, code identifiers); goal = maximally slick, polished, professional localization — accuracy NECESSARY, never SUFFICIENT; anti-bluff — captured machine-readable POSITIVE evidence (verdict + per-dimension rationale across {fidelity, fluency/naturalness, spirit/register, terminology, completeness, non-translatable-preservation}, feature_class=translation_review, §11.4.5/§11.4.69) and a FAIL on any dimension loops back to re-translation/polish until a zero-finding clean verdict (§11.4.134). REFINES §11.4.140 (canonical translation pipeline) / §11.4.141 (independent per-language translation review — from PASS/FAIL accuracy to context+spirit native polish; the KNOWN operator-owned §11.4.54 anchor-number collision on 11.4.140/11.4.141 cited strictly in those senses, re-mint still operator-owned, NO new collision introduced). Classification: universal (§11.4.17). Propagation gate CM-COVENANT-114-237-PROPAGATION + recommended gate CM-TRANSLATION-CONTEXT-SPIRIT-REVIEW + paired §1.1 mutation (accuracy-only check / self-reviewed-by-own-translator / golden-bad mistranslated-idiom or "translated" non-translatable product name → gate FAILs; gate-code = separate work item, NOT claimed shipped §11.4.6/§11.4.227). §11.4.237 amendment region byte-identical across the 4 mirrors CLAUDE.md + AGENTS.md + QWEN.md + GEMINI.md (full-block md5 05d4e829de58414ca8f7ce920b606173, §11.4.157 lockstep); Constitution.md carries the canonical ###-heading variant (identical body md5 8f518d2f25d8c61a94b114c32c2db308 — §11.4.227(B) canonical-vs-mirror layer variance legitimate, content-hash equality binds within the lockstep set); §11.4.237 exactly-once block-start per file (§11.4.227(B)), no anchor-number collision. Generated .html/.pdf/.docx twins NOT regenerated (exporter still not a runnable in-repo script — honestly STALE per §11.4.106(E)). Prior round: Amendment of 2026-07-26 — NEW universal anchor §11.4.234 (operator mandate 2026-07-26, verbatim: "We MUST have dedicated script to run hook validations, and commit and push mechanism ALWAYS unblocked!"): hook validations run as an EXPLICIT stage of a dedicated, idempotent commit/push script (consumer-bound path as DATA per §11.4.35 — Lava binding: scripts/commit-push-all.sh); automatic git hooks wired via core.hooksPath MUST NOT gate routine commit/push (disconnect = hooksPath unset, hook file preserved UNMODIFIED, --no-verify never the routine path); NO gate is lost (every disconnected check remains executed at a named script stage or release/tag gate, silently dropping one is a §11.4 PASS-bluff at the process layer); the commit/push mechanism is ALWAYS unblocked (failing validation = clear per-check report + documented remediation path, long multi-minute gates separable from cheap checks and skippable ONLY via an explicit recorded deferral flag — Lava binding: LAVA_SYNC_SKIP_CI=1 — never an opaque hung/rejected push). Classification: universal (§11.4.17). Propagation gate CM-COVENANT-114-234-PROPAGATION + recommended mechanism gates CM-DEDICATED-HOOK-VALIDATION-SCRIPT / CM-HOOKS-NEVER-BLOCK-PUSH / CM-NO-GATE-LOST-ON-HOOK-DISCONNECT / CM-COMMIT-PUSH-ALWAYS-UNBLOCKED + paired §1.1 mutations (gate-code = separate work item, NOT claimed shipped §11.4.6/§11.4.227). Amendment region byte-identical across all 5 governance files (md5-verified); §11.4.234 exactly-once block-start per file (§11.4.227(B)), no anchor-number collision. CLAUDE.md + AGENTS.md + QWEN.md + GEMINI.md mirrors updated in lockstep (§11.4.157). Generated .html/.pdf/.docx twins NOT regenerated (exporter still not a runnable in-repo script — honestly STALE per §11.4.106(E)). Prior round: Amendment of 2026-07-26 — the EFFORT-tiering + 5-field-label batch (operator IMPORTANT mandate 2026-07-26, verbatim: "Besides dynamic determining proper models to use, we MUST decide the effort as well and switch between the effort settings same as we do now for chosen model! Labeling MUST BE extended for this details as well. Example: (T1/main - claude4 - opus - high)."). §11.4.182 EXTENSION amended (in-place, no re-mint): the work-stream label form extends from</w:t>
             </w:r>
             <w:r>
               <w:t xml:space="preserve"> </w:t>
@@ -56907,6 +56899,335 @@
       </w:r>
       <w:r>
         <w:t xml:space="preserve">flag.</w:t>
+      </w:r>
+    </w:p>
+    <w:p>
+      <w:pPr>
+        <w:pStyle w:val="BodyText"/>
+      </w:pPr>
+      <w:r>
+        <w:rPr>
+          <w:b/>
+          <w:bCs/>
+        </w:rPr>
+        <w:t xml:space="preserve">§11.4.237 — Mandatory exhaustive context-and-spirit-aware translation review: every localized artifact independently reviewed for CONTEXT (source) + SPIRIT (target-language idiom/register) + technical/non-translatable fidelity — accuracy necessary, never sufficient (operator mandate, 2026-08-05).</w:t>
+      </w:r>
+    </w:p>
+    <w:p>
+      <w:pPr>
+        <w:pStyle w:val="BodyText"/>
+      </w:pPr>
+      <w:r>
+        <w:rPr>
+          <w:b/>
+          <w:bCs/>
+        </w:rPr>
+        <w:t xml:space="preserve">Forensic anchor (operator mandate, 2026-08-05):</w:t>
+      </w:r>
+      <w:r>
+        <w:t xml:space="preserve"> </w:t>
+      </w:r>
+      <w:r>
+        <w:t xml:space="preserve">a translated artifact that is merely ACCURATE — every source token faithfully rendered — can still read as stilted, foreign, machine-literal, register-wrong, or idiom-broken to a native speaker of the target language, and a localization pass that silently mangles a technical term or "translates" a non-translatable product/proper name ships a defect worse than untranslated text; the recurring failure mode is a translation that scores green on an accuracy check while a native reader immediately perceives it as non-native. Accuracy is NECESSARY; it is NOT SUFFICIENT for a slick, polished, professional localization.</w:t>
+      </w:r>
+    </w:p>
+    <w:p>
+      <w:pPr>
+        <w:pStyle w:val="BodyText"/>
+      </w:pPr>
+      <w:r>
+        <w:t xml:space="preserve">The mandate (ALL hold):</w:t>
+      </w:r>
+    </w:p>
+    <w:p>
+      <w:pPr>
+        <w:pStyle w:val="BodyText"/>
+      </w:pPr>
+      <w:r>
+        <w:rPr>
+          <w:b/>
+          <w:bCs/>
+        </w:rPr>
+        <w:t xml:space="preserve">(A) EVERY LOCALIZED ARTIFACT IS INDEPENDENTLY REVIEWED — NEVER SELF-REVIEWED.</w:t>
+      </w:r>
+      <w:r>
+        <w:t xml:space="preserve"> </w:t>
+      </w:r>
+      <w:r>
+        <w:t xml:space="preserve">Every translation and every translated artifact — UI strings, pages, documents, PDFs, manuals, marketing copy, captions/subtitles, help text, any localized content — MUST undergo a HEAVY, EXHAUSTIVE, independent review by a reviewer (agent or human) STRUCTURALLY SEPARATE from the translator that produced it (§11.4.70/§11.4.20 independence). The translator's own pass (§11.4.92 multi-pass self-review) PRECEDES this review and NEVER satisfies it (§11.4.142's no-self-review-substitution discipline applied to localization; §11.4.92 precedes, never satisfies). A localized artifact accepted without an independent context-and-spirit review is a §11.4 PASS-bluff at the localization layer.</w:t>
+      </w:r>
+    </w:p>
+    <w:p>
+      <w:pPr>
+        <w:pStyle w:val="BodyText"/>
+      </w:pPr>
+      <w:r>
+        <w:rPr>
+          <w:b/>
+          <w:bCs/>
+        </w:rPr>
+        <w:t xml:space="preserve">(B) THE REVIEWER HOLDS AND APPLIES THREE DIMENSIONS.</w:t>
+      </w:r>
+      <w:r>
+        <w:t xml:space="preserve"> </w:t>
+      </w:r>
+      <w:r>
+        <w:t xml:space="preserve">(a) FULL CONTEXT OF THE SOURCE MATERIAL — the original ideas, the subject/domain, the purpose, and the intended audience; the reviewer reads the source MEANING, not merely the source STRING, so intent, nuance, and tone are carried across, never lost. (b) THE SPIRIT OF THE TARGET LANGUAGE — its tradition, idiom, register, tone, and cultural conventions — so the result reads as NATIVE, natural, fluent, and MAXIMALLY POLISHED, never literal / word-for-word / calqued; a construction correct in the source that reads foreign in the target is REWRITTEN into the natural target-language form. (c) CORRECT TECHNICAL VOCABULARY AND VERBATIM PRESERVATION OF NON-TRANSLATABLE TERMS — domain/technical terms rendered with their established target-language equivalents, and NON-TRANSLATABLE tokens (product names, brand names, proper nouns, technology/library/API names, code identifiers, trademarks) preserved VERBATIM — never "translated", never accidentally transliterated, never localized away.</w:t>
+      </w:r>
+    </w:p>
+    <w:p>
+      <w:pPr>
+        <w:pStyle w:val="BodyText"/>
+      </w:pPr>
+      <w:r>
+        <w:rPr>
+          <w:b/>
+          <w:bCs/>
+        </w:rPr>
+        <w:t xml:space="preserve">(C) THE GOAL IS MAXIMALLY POLISHED LOCALIZATION — ACCURACY NECESSARY, NEVER SUFFICIENT.</w:t>
+      </w:r>
+      <w:r>
+        <w:t xml:space="preserve"> </w:t>
+      </w:r>
+      <w:r>
+        <w:t xml:space="preserve">The bar is a slick, polished, professional, native-reading localization; fidelity to the source is the FLOOR, not the ceiling. A rendering that is accurate but stilted / foreign / register-wrong / idiom-broken is a FINDING, not a pass.</w:t>
+      </w:r>
+    </w:p>
+    <w:p>
+      <w:pPr>
+        <w:pStyle w:val="BodyText"/>
+      </w:pPr>
+      <w:r>
+        <w:rPr>
+          <w:b/>
+          <w:bCs/>
+        </w:rPr>
+        <w:t xml:space="preserve">(D) ANTI-BLUFF — CAPTURED MACHINE-READABLE POSITIVE EVIDENCE + FAIL-LOOPS-TO-CLEAN.</w:t>
+      </w:r>
+      <w:r>
+        <w:t xml:space="preserve"> </w:t>
+      </w:r>
+      <w:r>
+        <w:t xml:space="preserve">The review emits captured, machine-readable POSITIVE evidence per §11.4.5/§11.4.69 (</w:t>
+      </w:r>
+      <w:r>
+        <w:rPr>
+          <w:rStyle w:val="VerbatimChar"/>
+        </w:rPr>
+        <w:t xml:space="preserve">feature_class</w:t>
+      </w:r>
+      <w:r>
+        <w:t xml:space="preserve"> </w:t>
+      </w:r>
+      <w:r>
+        <w:t xml:space="preserve">= translation_review): a per-artifact verdict carrying a PER-DIMENSION rationale across the closed dimension set {fidelity, fluency/naturalness, spirit/register, terminology, completeness, non-translatable-preservation} — a PASS with no captured per-dimension rationale is a §11.4/§11.4.1 bluff. A FAIL on ANY dimension LOOPS BACK to re-translation/polish and re-review, iterating to a zero-finding clean verdict per §11.4.134 — a single pass that "looked fine" never closes the artifact.</w:t>
+      </w:r>
+    </w:p>
+    <w:p>
+      <w:pPr>
+        <w:pStyle w:val="BodyText"/>
+      </w:pPr>
+      <w:r>
+        <w:rPr>
+          <w:b/>
+          <w:bCs/>
+        </w:rPr>
+        <w:t xml:space="preserve">Honest boundary (§11.4.6).</w:t>
+      </w:r>
+      <w:r>
+        <w:t xml:space="preserve"> </w:t>
+      </w:r>
+      <w:r>
+        <w:t xml:space="preserve">This anchor REFINES the existing localization discipline from PASS/FAIL accuracy checking to CONTEXT-AND-SPIRIT native-polish review; it does NOT replace §11.4.140's canonical translation pipeline (the HelixTranslate-canonical-translation-pipeline sense of that anchor number) nor §11.4.141's independent per-language review (the independent-per-language-translation-review sense of that anchor number — a KNOWN operator-owned §11.4.54 anchor-number collision on</w:t>
+      </w:r>
+      <w:r>
+        <w:t xml:space="preserve"> </w:t>
+      </w:r>
+      <w:r>
+        <w:rPr>
+          <w:rStyle w:val="VerbatimChar"/>
+        </w:rPr>
+        <w:t xml:space="preserve">11.4.140</w:t>
+      </w:r>
+      <w:r>
+        <w:t xml:space="preserve">/</w:t>
+      </w:r>
+      <w:r>
+        <w:rPr>
+          <w:rStyle w:val="VerbatimChar"/>
+        </w:rPr>
+        <w:t xml:space="preserve">11.4.141</w:t>
+      </w:r>
+      <w:r>
+        <w:t xml:space="preserve">, re-mint still operator-owned; cited here strictly in those senses, introducing no new collision), it STRENGTHENS them (accuracy → native polish). It does not make a mistranslation impossible (a miscalibrated reviewer stays §11.4.107(10) golden-good/golden-bad fixture territory), and where a target language genuinely has no established term for a source concept, that gap is an honestly recorded finding (§11.4.3 SKIP-with-reason), never a silently invented word.</w:t>
+      </w:r>
+    </w:p>
+    <w:p>
+      <w:pPr>
+        <w:pStyle w:val="BodyText"/>
+      </w:pPr>
+      <w:r>
+        <w:t xml:space="preserve">Classification: universal (§11.4.17) — no vendor/project/language literal; the consuming project supplies its language set, term glossary, non-translatable token list, and reviewer substrate as DATA per §11.4.35. Composes §11.4.140 (canonical translation pipeline) / §11.4.141 (independent per-language translation review — this REFINES it from PASS/FAIL accuracy to context+spirit polish) / §11.4.6 / §11.4.69 / §11.4.92 / §11.4.134 / §11.4.142 / §11.4.209 / §1.1. Propagation gate</w:t>
+      </w:r>
+      <w:r>
+        <w:t xml:space="preserve"> </w:t>
+      </w:r>
+      <w:r>
+        <w:rPr>
+          <w:rStyle w:val="VerbatimChar"/>
+        </w:rPr>
+        <w:t xml:space="preserve">CM-COVENANT-114-237-PROPAGATION</w:t>
+      </w:r>
+      <w:r>
+        <w:t xml:space="preserve"> </w:t>
+      </w:r>
+      <w:r>
+        <w:t xml:space="preserve">(literal</w:t>
+      </w:r>
+      <w:r>
+        <w:t xml:space="preserve"> </w:t>
+      </w:r>
+      <w:r>
+        <w:rPr>
+          <w:rStyle w:val="VerbatimChar"/>
+        </w:rPr>
+        <w:t xml:space="preserve">11.4.237</w:t>
+      </w:r>
+      <w:r>
+        <w:t xml:space="preserve">) + recommended gate</w:t>
+      </w:r>
+      <w:r>
+        <w:t xml:space="preserve"> </w:t>
+      </w:r>
+      <w:r>
+        <w:rPr>
+          <w:rStyle w:val="VerbatimChar"/>
+        </w:rPr>
+        <w:t xml:space="preserve">CM-TRANSLATION-CONTEXT-SPIRIT-REVIEW</w:t>
+      </w:r>
+      <w:r>
+        <w:t xml:space="preserve"> </w:t>
+      </w:r>
+      <w:r>
+        <w:t xml:space="preserve">(every localized artifact carries an independent per-dimension context-and-spirit review verdict with captured rationale across {fidelity, fluency/naturalness, spirit/register, terminology, completeness, non-translatable-preservation}, FAIL looping to re-review per §11.4.134) + paired §1.1 mutation (a translation accepted on an accuracy-only check, OR self-reviewed by its own translator, OR carrying a golden-bad-seeded mistranslated idiom / a "translated" non-translatable product name → the gate FAILs; strip the literal → the propagation gate FAILs; gate-code = separate work item, NOT claimed shipped §11.4.6/§11.4.227).</w:t>
+      </w:r>
+    </w:p>
+    <w:p>
+      <w:pPr>
+        <w:pStyle w:val="BodyText"/>
+      </w:pPr>
+      <w:r>
+        <w:rPr>
+          <w:b/>
+          <w:bCs/>
+        </w:rPr>
+        <w:t xml:space="preserve">Canonical authority:</w:t>
+      </w:r>
+      <w:r>
+        <w:t xml:space="preserve"> </w:t>
+      </w:r>
+      <w:r>
+        <w:t xml:space="preserve">constitution submodule</w:t>
+      </w:r>
+      <w:r>
+        <w:t xml:space="preserve"> </w:t>
+      </w:r>
+      <w:hyperlink r:id="rId57">
+        <w:r>
+          <w:rPr>
+            <w:rStyle w:val="VerbatimChar"/>
+          </w:rPr>
+          <w:t xml:space="preserve">Constitution.md</w:t>
+        </w:r>
+      </w:hyperlink>
+      <w:r>
+        <w:t xml:space="preserve"> </w:t>
+      </w:r>
+      <w:r>
+        <w:t xml:space="preserve">§11.4.237.</w:t>
+      </w:r>
+    </w:p>
+    <w:p>
+      <w:pPr>
+        <w:pStyle w:val="BodyText"/>
+      </w:pPr>
+      <w:r>
+        <w:t xml:space="preserve">Non-compliance is a release blocker regardless of context. No escape hatch — no</w:t>
+      </w:r>
+      <w:r>
+        <w:t xml:space="preserve"> </w:t>
+      </w:r>
+      <w:r>
+        <w:rPr>
+          <w:rStyle w:val="VerbatimChar"/>
+        </w:rPr>
+        <w:t xml:space="preserve">--skip-spirit-review</w:t>
+      </w:r>
+      <w:r>
+        <w:t xml:space="preserve">,</w:t>
+      </w:r>
+      <w:r>
+        <w:t xml:space="preserve"> </w:t>
+      </w:r>
+      <w:r>
+        <w:rPr>
+          <w:rStyle w:val="VerbatimChar"/>
+        </w:rPr>
+        <w:t xml:space="preserve">--accuracy-only-OK</w:t>
+      </w:r>
+      <w:r>
+        <w:t xml:space="preserve">,</w:t>
+      </w:r>
+      <w:r>
+        <w:t xml:space="preserve"> </w:t>
+      </w:r>
+      <w:r>
+        <w:rPr>
+          <w:rStyle w:val="VerbatimChar"/>
+        </w:rPr>
+        <w:t xml:space="preserve">--self-review-translation-OK</w:t>
+      </w:r>
+      <w:r>
+        <w:t xml:space="preserve">,</w:t>
+      </w:r>
+      <w:r>
+        <w:t xml:space="preserve"> </w:t>
+      </w:r>
+      <w:r>
+        <w:rPr>
+          <w:rStyle w:val="VerbatimChar"/>
+        </w:rPr>
+        <w:t xml:space="preserve">--literal-translation-OK</w:t>
+      </w:r>
+      <w:r>
+        <w:t xml:space="preserve">,</w:t>
+      </w:r>
+      <w:r>
+        <w:t xml:space="preserve"> </w:t>
+      </w:r>
+      <w:r>
+        <w:rPr>
+          <w:rStyle w:val="VerbatimChar"/>
+        </w:rPr>
+        <w:t xml:space="preserve">--translate-non-translatable-OK</w:t>
+      </w:r>
+      <w:r>
+        <w:t xml:space="preserve">,</w:t>
+      </w:r>
+      <w:r>
+        <w:t xml:space="preserve"> </w:t>
+      </w:r>
+      <w:r>
+        <w:rPr>
+          <w:rStyle w:val="VerbatimChar"/>
+        </w:rPr>
+        <w:t xml:space="preserve">--skip-per-dimension-rationale</w:t>
+      </w:r>
+      <w:r>
+        <w:t xml:space="preserve"> </w:t>
+      </w:r>
+      <w:r>
+        <w:t xml:space="preserve">flag exists.</w:t>
       </w:r>
     </w:p>
     <w:bookmarkEnd w:id="120"/>

</xml_diff>

<commit_message>
cascade: chore(governance): V10 2026.08 docs/tracker sync and pre-build greenification — gate-mutation pairing, Fixed_Summary/Issues_Summary sync + colorize, universal markdown exports, codegraph OpenCode MCP, constitution design-toolkit layout, docs_chain/workable_items/status-custody sync, pre_build_verification.sh set -e guard fix
(committed by parent commit_all.sh cascade depth=1)
</commit_message>
<xml_diff>
--- a/CLAUDE.docx
+++ b/CLAUDE.docx
@@ -163,7 +163,7 @@
               <w:pStyle w:val="Compact"/>
             </w:pPr>
             <w:r>
-              <w:t xml:space="preserve">Amendment of 2026-07-26 — NEW universal anchor §11.4.234 (operator mandate 2026-07-26, verbatim: "We MUST have dedicated script to run hook validations, and commit and push mechanism ALWAYS unblocked!"): hook validations run as an EXPLICIT stage of a dedicated, idempotent commit/push script (consumer-bound path as DATA per §11.4.35 — Lava binding: scripts/commit-push-all.sh); automatic git hooks wired via core.hooksPath MUST NOT gate routine commit/push (disconnect = hooksPath unset, hook file preserved UNMODIFIED, --no-verify never the routine path); NO gate is lost (every disconnected check remains executed at a named script stage or release/tag gate, silently dropping one is a §11.4 PASS-bluff at the process layer); the commit/push mechanism is ALWAYS unblocked (failing validation = clear per-check report + documented remediation path, long multi-minute gates separable from cheap checks and skippable ONLY via an explicit recorded deferral flag — Lava binding: LAVA_SYNC_SKIP_CI=1 — never an opaque hung/rejected push). Classification: universal (§11.4.17). Propagation gate CM-COVENANT-114-234-PROPAGATION + recommended mechanism gates CM-DEDICATED-HOOK-VALIDATION-SCRIPT / CM-HOOKS-NEVER-BLOCK-PUSH / CM-NO-GATE-LOST-ON-HOOK-DISCONNECT / CM-COMMIT-PUSH-ALWAYS-UNBLOCKED + paired §1.1 mutations (gate-code = separate work item, NOT claimed shipped §11.4.6/§11.4.227). Amendment region byte-identical across all 5 governance files (md5-verified); §11.4.234 exactly-once block-start per file (§11.4.227(B)), no anchor-number collision. CLAUDE.md + AGENTS.md + QWEN.md + GEMINI.md mirrors updated in lockstep (§11.4.157). Generated .html/.pdf/.docx twins NOT regenerated (exporter still not a runnable in-repo script — honestly STALE per §11.4.106(E)). Prior round: Amendment of 2026-07-26 — the EFFORT-tiering + 5-field-label batch (operator IMPORTANT mandate 2026-07-26, verbatim: "Besides dynamic determining proper models to use, we MUST decide the effort as well and switch between the effort settings same as we do now for chosen model! Labeling MUST BE extended for this details as well. Example: (T1/main - claude4 - opus - high)."). §11.4.182 EXTENSION amended (in-place, no re-mint): the work-stream label form extends from</w:t>
+              <w:t xml:space="preserve">Amendment of 2026-08-05 — NEW universal anchor §11.4.237 (operator mandate 2026-08-05): every translation / translated artifact (UI strings, pages, documents, PDFs, any localized content) MUST undergo a HEAVY, EXHAUSTIVE, INDEPENDENT context-and-spirit-aware review by a reviewer STRUCTURALLY SEPARATE from the translator (never self-review — §11.4.92 precedes, §11.4.142 never satisfies); the reviewer holds + applies (a) full CONTEXT of the source material (original ideas / subject-domain / purpose / audience), (b) the SPIRIT / idiom / register / tradition / cultural-conventions of the TARGET language so the result reads NATIVE + natural + maximally polished, never literal/word-for-word/calqued, and (c) correct TECHNICAL vocabulary + VERBATIM preservation of NON-TRANSLATABLE terms (product/brand/proper names, technology/library/API names, code identifiers); goal = maximally slick, polished, professional localization — accuracy NECESSARY, never SUFFICIENT; anti-bluff — captured machine-readable POSITIVE evidence (verdict + per-dimension rationale across {fidelity, fluency/naturalness, spirit/register, terminology, completeness, non-translatable-preservation}, feature_class=translation_review, §11.4.5/§11.4.69) and a FAIL on any dimension loops back to re-translation/polish until a zero-finding clean verdict (§11.4.134). REFINES §11.4.140 (canonical translation pipeline) / §11.4.141 (independent per-language translation review — from PASS/FAIL accuracy to context+spirit native polish; the KNOWN operator-owned §11.4.54 anchor-number collision on 11.4.140/11.4.141 cited strictly in those senses, re-mint still operator-owned, NO new collision introduced). Classification: universal (§11.4.17). Propagation gate CM-COVENANT-114-237-PROPAGATION + recommended gate CM-TRANSLATION-CONTEXT-SPIRIT-REVIEW + paired §1.1 mutation (accuracy-only check / self-reviewed-by-own-translator / golden-bad mistranslated-idiom or "translated" non-translatable product name → gate FAILs; gate-code = separate work item, NOT claimed shipped §11.4.6/§11.4.227). §11.4.237 amendment region byte-identical across the 4 mirrors CLAUDE.md + AGENTS.md + QWEN.md + GEMINI.md (full-block md5 05d4e829de58414ca8f7ce920b606173, §11.4.157 lockstep); Constitution.md carries the canonical ###-heading variant (identical body md5 8f518d2f25d8c61a94b114c32c2db308 — §11.4.227(B) canonical-vs-mirror layer variance legitimate, content-hash equality binds within the lockstep set); §11.4.237 exactly-once block-start per file (§11.4.227(B)), no anchor-number collision. Generated .html/.pdf/.docx twins NOT regenerated (exporter still not a runnable in-repo script — honestly STALE per §11.4.106(E)). Prior round: Amendment of 2026-07-26 — NEW universal anchor §11.4.234 (operator mandate 2026-07-26, verbatim: "We MUST have dedicated script to run hook validations, and commit and push mechanism ALWAYS unblocked!"): hook validations run as an EXPLICIT stage of a dedicated, idempotent commit/push script (consumer-bound path as DATA per §11.4.35 — Lava binding: scripts/commit-push-all.sh); automatic git hooks wired via core.hooksPath MUST NOT gate routine commit/push (disconnect = hooksPath unset, hook file preserved UNMODIFIED, --no-verify never the routine path); NO gate is lost (every disconnected check remains executed at a named script stage or release/tag gate, silently dropping one is a §11.4 PASS-bluff at the process layer); the commit/push mechanism is ALWAYS unblocked (failing validation = clear per-check report + documented remediation path, long multi-minute gates separable from cheap checks and skippable ONLY via an explicit recorded deferral flag — Lava binding: LAVA_SYNC_SKIP_CI=1 — never an opaque hung/rejected push). Classification: universal (§11.4.17). Propagation gate CM-COVENANT-114-234-PROPAGATION + recommended mechanism gates CM-DEDICATED-HOOK-VALIDATION-SCRIPT / CM-HOOKS-NEVER-BLOCK-PUSH / CM-NO-GATE-LOST-ON-HOOK-DISCONNECT / CM-COMMIT-PUSH-ALWAYS-UNBLOCKED + paired §1.1 mutations (gate-code = separate work item, NOT claimed shipped §11.4.6/§11.4.227). Amendment region byte-identical across all 5 governance files (md5-verified); §11.4.234 exactly-once block-start per file (§11.4.227(B)), no anchor-number collision. CLAUDE.md + AGENTS.md + QWEN.md + GEMINI.md mirrors updated in lockstep (§11.4.157). Generated .html/.pdf/.docx twins NOT regenerated (exporter still not a runnable in-repo script — honestly STALE per §11.4.106(E)). Prior round: Amendment of 2026-07-26 — the EFFORT-tiering + 5-field-label batch (operator IMPORTANT mandate 2026-07-26, verbatim: "Besides dynamic determining proper models to use, we MUST decide the effort as well and switch between the effort settings same as we do now for chosen model! Labeling MUST BE extended for this details as well. Example: (T1/main - claude4 - opus - high)."). §11.4.182 EXTENSION amended (in-place, no re-mint): the work-stream label form extends from</w:t>
             </w:r>
             <w:r>
               <w:t xml:space="preserve"> </w:t>
@@ -56893,6 +56893,687 @@
           <w:rStyle w:val="VerbatimChar"/>
         </w:rPr>
         <w:t xml:space="preserve">--silent-override</w:t>
+      </w:r>
+      <w:r>
+        <w:t xml:space="preserve"> </w:t>
+      </w:r>
+      <w:r>
+        <w:t xml:space="preserve">flag.</w:t>
+      </w:r>
+    </w:p>
+    <w:p>
+      <w:pPr>
+        <w:pStyle w:val="BodyText"/>
+      </w:pPr>
+      <w:r>
+        <w:rPr>
+          <w:b/>
+          <w:bCs/>
+        </w:rPr>
+        <w:t xml:space="preserve">§11.4.237 — Mandatory exhaustive context-and-spirit-aware translation review: every localized artifact independently reviewed for CONTEXT (source) + SPIRIT (target-language idiom/register) + technical/non-translatable fidelity — accuracy necessary, never sufficient (operator mandate, 2026-08-05).</w:t>
+      </w:r>
+    </w:p>
+    <w:p>
+      <w:pPr>
+        <w:pStyle w:val="BodyText"/>
+      </w:pPr>
+      <w:r>
+        <w:rPr>
+          <w:b/>
+          <w:bCs/>
+        </w:rPr>
+        <w:t xml:space="preserve">Forensic anchor (operator mandate, 2026-08-05):</w:t>
+      </w:r>
+      <w:r>
+        <w:t xml:space="preserve"> </w:t>
+      </w:r>
+      <w:r>
+        <w:t xml:space="preserve">a translated artifact that is merely ACCURATE — every source token faithfully rendered — can still read as stilted, foreign, machine-literal, register-wrong, or idiom-broken to a native speaker of the target language, and a localization pass that silently mangles a technical term or "translates" a non-translatable product/proper name ships a defect worse than untranslated text; the recurring failure mode is a translation that scores green on an accuracy check while a native reader immediately perceives it as non-native. Accuracy is NECESSARY; it is NOT SUFFICIENT for a slick, polished, professional localization.</w:t>
+      </w:r>
+    </w:p>
+    <w:p>
+      <w:pPr>
+        <w:pStyle w:val="BodyText"/>
+      </w:pPr>
+      <w:r>
+        <w:t xml:space="preserve">The mandate (ALL hold):</w:t>
+      </w:r>
+    </w:p>
+    <w:p>
+      <w:pPr>
+        <w:pStyle w:val="BodyText"/>
+      </w:pPr>
+      <w:r>
+        <w:rPr>
+          <w:b/>
+          <w:bCs/>
+        </w:rPr>
+        <w:t xml:space="preserve">(A) EVERY LOCALIZED ARTIFACT IS INDEPENDENTLY REVIEWED — NEVER SELF-REVIEWED.</w:t>
+      </w:r>
+      <w:r>
+        <w:t xml:space="preserve"> </w:t>
+      </w:r>
+      <w:r>
+        <w:t xml:space="preserve">Every translation and every translated artifact — UI strings, pages, documents, PDFs, manuals, marketing copy, captions/subtitles, help text, any localized content — MUST undergo a HEAVY, EXHAUSTIVE, independent review by a reviewer (agent or human) STRUCTURALLY SEPARATE from the translator that produced it (§11.4.70/§11.4.20 independence). The translator's own pass (§11.4.92 multi-pass self-review) PRECEDES this review and NEVER satisfies it (§11.4.142's no-self-review-substitution discipline applied to localization; §11.4.92 precedes, never satisfies). A localized artifact accepted without an independent context-and-spirit review is a §11.4 PASS-bluff at the localization layer.</w:t>
+      </w:r>
+    </w:p>
+    <w:p>
+      <w:pPr>
+        <w:pStyle w:val="BodyText"/>
+      </w:pPr>
+      <w:r>
+        <w:rPr>
+          <w:b/>
+          <w:bCs/>
+        </w:rPr>
+        <w:t xml:space="preserve">(B) THE REVIEWER HOLDS AND APPLIES THREE DIMENSIONS.</w:t>
+      </w:r>
+      <w:r>
+        <w:t xml:space="preserve"> </w:t>
+      </w:r>
+      <w:r>
+        <w:t xml:space="preserve">(a) FULL CONTEXT OF THE SOURCE MATERIAL — the original ideas, the subject/domain, the purpose, and the intended audience; the reviewer reads the source MEANING, not merely the source STRING, so intent, nuance, and tone are carried across, never lost. (b) THE SPIRIT OF THE TARGET LANGUAGE — its tradition, idiom, register, tone, and cultural conventions — so the result reads as NATIVE, natural, fluent, and MAXIMALLY POLISHED, never literal / word-for-word / calqued; a construction correct in the source that reads foreign in the target is REWRITTEN into the natural target-language form. (c) CORRECT TECHNICAL VOCABULARY AND VERBATIM PRESERVATION OF NON-TRANSLATABLE TERMS — domain/technical terms rendered with their established target-language equivalents, and NON-TRANSLATABLE tokens (product names, brand names, proper nouns, technology/library/API names, code identifiers, trademarks) preserved VERBATIM — never "translated", never accidentally transliterated, never localized away.</w:t>
+      </w:r>
+    </w:p>
+    <w:p>
+      <w:pPr>
+        <w:pStyle w:val="BodyText"/>
+      </w:pPr>
+      <w:r>
+        <w:rPr>
+          <w:b/>
+          <w:bCs/>
+        </w:rPr>
+        <w:t xml:space="preserve">(C) THE GOAL IS MAXIMALLY POLISHED LOCALIZATION — ACCURACY NECESSARY, NEVER SUFFICIENT.</w:t>
+      </w:r>
+      <w:r>
+        <w:t xml:space="preserve"> </w:t>
+      </w:r>
+      <w:r>
+        <w:t xml:space="preserve">The bar is a slick, polished, professional, native-reading localization; fidelity to the source is the FLOOR, not the ceiling. A rendering that is accurate but stilted / foreign / register-wrong / idiom-broken is a FINDING, not a pass.</w:t>
+      </w:r>
+    </w:p>
+    <w:p>
+      <w:pPr>
+        <w:pStyle w:val="BodyText"/>
+      </w:pPr>
+      <w:r>
+        <w:rPr>
+          <w:b/>
+          <w:bCs/>
+        </w:rPr>
+        <w:t xml:space="preserve">(D) ANTI-BLUFF — CAPTURED MACHINE-READABLE POSITIVE EVIDENCE + FAIL-LOOPS-TO-CLEAN.</w:t>
+      </w:r>
+      <w:r>
+        <w:t xml:space="preserve"> </w:t>
+      </w:r>
+      <w:r>
+        <w:t xml:space="preserve">The review emits captured, machine-readable POSITIVE evidence per §11.4.5/§11.4.69 (</w:t>
+      </w:r>
+      <w:r>
+        <w:rPr>
+          <w:rStyle w:val="VerbatimChar"/>
+        </w:rPr>
+        <w:t xml:space="preserve">feature_class</w:t>
+      </w:r>
+      <w:r>
+        <w:t xml:space="preserve"> </w:t>
+      </w:r>
+      <w:r>
+        <w:t xml:space="preserve">= translation_review): a per-artifact verdict carrying a PER-DIMENSION rationale across the closed dimension set {fidelity, fluency/naturalness, spirit/register, terminology, completeness, non-translatable-preservation} — a PASS with no captured per-dimension rationale is a §11.4/§11.4.1 bluff. A FAIL on ANY dimension LOOPS BACK to re-translation/polish and re-review, iterating to a zero-finding clean verdict per §11.4.134 — a single pass that "looked fine" never closes the artifact.</w:t>
+      </w:r>
+    </w:p>
+    <w:p>
+      <w:pPr>
+        <w:pStyle w:val="BodyText"/>
+      </w:pPr>
+      <w:r>
+        <w:rPr>
+          <w:b/>
+          <w:bCs/>
+        </w:rPr>
+        <w:t xml:space="preserve">Honest boundary (§11.4.6).</w:t>
+      </w:r>
+      <w:r>
+        <w:t xml:space="preserve"> </w:t>
+      </w:r>
+      <w:r>
+        <w:t xml:space="preserve">This anchor REFINES the existing localization discipline from PASS/FAIL accuracy checking to CONTEXT-AND-SPIRIT native-polish review; it does NOT replace §11.4.140's canonical translation pipeline (the HelixTranslate-canonical-translation-pipeline sense of that anchor number) nor §11.4.141's independent per-language review (the independent-per-language-translation-review sense of that anchor number — a KNOWN operator-owned §11.4.54 anchor-number collision on</w:t>
+      </w:r>
+      <w:r>
+        <w:t xml:space="preserve"> </w:t>
+      </w:r>
+      <w:r>
+        <w:rPr>
+          <w:rStyle w:val="VerbatimChar"/>
+        </w:rPr>
+        <w:t xml:space="preserve">11.4.140</w:t>
+      </w:r>
+      <w:r>
+        <w:t xml:space="preserve">/</w:t>
+      </w:r>
+      <w:r>
+        <w:rPr>
+          <w:rStyle w:val="VerbatimChar"/>
+        </w:rPr>
+        <w:t xml:space="preserve">11.4.141</w:t>
+      </w:r>
+      <w:r>
+        <w:t xml:space="preserve">, re-mint still operator-owned; cited here strictly in those senses, introducing no new collision), it STRENGTHENS them (accuracy → native polish). It does not make a mistranslation impossible (a miscalibrated reviewer stays §11.4.107(10) golden-good/golden-bad fixture territory), and where a target language genuinely has no established term for a source concept, that gap is an honestly recorded finding (§11.4.3 SKIP-with-reason), never a silently invented word.</w:t>
+      </w:r>
+    </w:p>
+    <w:p>
+      <w:pPr>
+        <w:pStyle w:val="BodyText"/>
+      </w:pPr>
+      <w:r>
+        <w:t xml:space="preserve">Classification: universal (§11.4.17) — no vendor/project/language literal; the consuming project supplies its language set, term glossary, non-translatable token list, and reviewer substrate as DATA per §11.4.35. Composes §11.4.140 (canonical translation pipeline) / §11.4.141 (independent per-language translation review — this REFINES it from PASS/FAIL accuracy to context+spirit polish) / §11.4.6 / §11.4.69 / §11.4.92 / §11.4.134 / §11.4.142 / §11.4.209 / §1.1. Propagation gate</w:t>
+      </w:r>
+      <w:r>
+        <w:t xml:space="preserve"> </w:t>
+      </w:r>
+      <w:r>
+        <w:rPr>
+          <w:rStyle w:val="VerbatimChar"/>
+        </w:rPr>
+        <w:t xml:space="preserve">CM-COVENANT-114-237-PROPAGATION</w:t>
+      </w:r>
+      <w:r>
+        <w:t xml:space="preserve"> </w:t>
+      </w:r>
+      <w:r>
+        <w:t xml:space="preserve">(literal</w:t>
+      </w:r>
+      <w:r>
+        <w:t xml:space="preserve"> </w:t>
+      </w:r>
+      <w:r>
+        <w:rPr>
+          <w:rStyle w:val="VerbatimChar"/>
+        </w:rPr>
+        <w:t xml:space="preserve">11.4.237</w:t>
+      </w:r>
+      <w:r>
+        <w:t xml:space="preserve">) + recommended gate</w:t>
+      </w:r>
+      <w:r>
+        <w:t xml:space="preserve"> </w:t>
+      </w:r>
+      <w:r>
+        <w:rPr>
+          <w:rStyle w:val="VerbatimChar"/>
+        </w:rPr>
+        <w:t xml:space="preserve">CM-TRANSLATION-CONTEXT-SPIRIT-REVIEW</w:t>
+      </w:r>
+      <w:r>
+        <w:t xml:space="preserve"> </w:t>
+      </w:r>
+      <w:r>
+        <w:t xml:space="preserve">(every localized artifact carries an independent per-dimension context-and-spirit review verdict with captured rationale across {fidelity, fluency/naturalness, spirit/register, terminology, completeness, non-translatable-preservation}, FAIL looping to re-review per §11.4.134) + paired §1.1 mutation (a translation accepted on an accuracy-only check, OR self-reviewed by its own translator, OR carrying a golden-bad-seeded mistranslated idiom / a "translated" non-translatable product name → the gate FAILs; strip the literal → the propagation gate FAILs; gate-code = separate work item, NOT claimed shipped §11.4.6/§11.4.227).</w:t>
+      </w:r>
+    </w:p>
+    <w:p>
+      <w:pPr>
+        <w:pStyle w:val="BodyText"/>
+      </w:pPr>
+      <w:r>
+        <w:rPr>
+          <w:b/>
+          <w:bCs/>
+        </w:rPr>
+        <w:t xml:space="preserve">Canonical authority:</w:t>
+      </w:r>
+      <w:r>
+        <w:t xml:space="preserve"> </w:t>
+      </w:r>
+      <w:r>
+        <w:t xml:space="preserve">constitution submodule</w:t>
+      </w:r>
+      <w:r>
+        <w:t xml:space="preserve"> </w:t>
+      </w:r>
+      <w:hyperlink r:id="rId57">
+        <w:r>
+          <w:rPr>
+            <w:rStyle w:val="VerbatimChar"/>
+          </w:rPr>
+          <w:t xml:space="preserve">Constitution.md</w:t>
+        </w:r>
+      </w:hyperlink>
+      <w:r>
+        <w:t xml:space="preserve"> </w:t>
+      </w:r>
+      <w:r>
+        <w:t xml:space="preserve">§11.4.237.</w:t>
+      </w:r>
+    </w:p>
+    <w:p>
+      <w:pPr>
+        <w:pStyle w:val="BodyText"/>
+      </w:pPr>
+      <w:r>
+        <w:t xml:space="preserve">Non-compliance is a release blocker regardless of context. No escape hatch — no</w:t>
+      </w:r>
+      <w:r>
+        <w:t xml:space="preserve"> </w:t>
+      </w:r>
+      <w:r>
+        <w:rPr>
+          <w:rStyle w:val="VerbatimChar"/>
+        </w:rPr>
+        <w:t xml:space="preserve">--skip-spirit-review</w:t>
+      </w:r>
+      <w:r>
+        <w:t xml:space="preserve">,</w:t>
+      </w:r>
+      <w:r>
+        <w:t xml:space="preserve"> </w:t>
+      </w:r>
+      <w:r>
+        <w:rPr>
+          <w:rStyle w:val="VerbatimChar"/>
+        </w:rPr>
+        <w:t xml:space="preserve">--accuracy-only-OK</w:t>
+      </w:r>
+      <w:r>
+        <w:t xml:space="preserve">,</w:t>
+      </w:r>
+      <w:r>
+        <w:t xml:space="preserve"> </w:t>
+      </w:r>
+      <w:r>
+        <w:rPr>
+          <w:rStyle w:val="VerbatimChar"/>
+        </w:rPr>
+        <w:t xml:space="preserve">--self-review-translation-OK</w:t>
+      </w:r>
+      <w:r>
+        <w:t xml:space="preserve">,</w:t>
+      </w:r>
+      <w:r>
+        <w:t xml:space="preserve"> </w:t>
+      </w:r>
+      <w:r>
+        <w:rPr>
+          <w:rStyle w:val="VerbatimChar"/>
+        </w:rPr>
+        <w:t xml:space="preserve">--literal-translation-OK</w:t>
+      </w:r>
+      <w:r>
+        <w:t xml:space="preserve">,</w:t>
+      </w:r>
+      <w:r>
+        <w:t xml:space="preserve"> </w:t>
+      </w:r>
+      <w:r>
+        <w:rPr>
+          <w:rStyle w:val="VerbatimChar"/>
+        </w:rPr>
+        <w:t xml:space="preserve">--translate-non-translatable-OK</w:t>
+      </w:r>
+      <w:r>
+        <w:t xml:space="preserve">,</w:t>
+      </w:r>
+      <w:r>
+        <w:t xml:space="preserve"> </w:t>
+      </w:r>
+      <w:r>
+        <w:rPr>
+          <w:rStyle w:val="VerbatimChar"/>
+        </w:rPr>
+        <w:t xml:space="preserve">--skip-per-dimension-rationale</w:t>
+      </w:r>
+      <w:r>
+        <w:t xml:space="preserve"> </w:t>
+      </w:r>
+      <w:r>
+        <w:t xml:space="preserve">flag exists.</w:t>
+      </w:r>
+    </w:p>
+    <w:p>
+      <w:pPr>
+        <w:pStyle w:val="BodyText"/>
+      </w:pPr>
+      <w:r>
+        <w:rPr>
+          <w:b/>
+          <w:bCs/>
+        </w:rPr>
+        <w:t xml:space="preserve">§11.4.238 — Automated QA must be the DISCOVERER: manual QA finds nothing new, and anything it finds is a coverage escape (User mandate, 2026-08-08).</w:t>
+      </w:r>
+      <w:r>
+        <w:t xml:space="preserve"> </w:t>
+      </w:r>
+      <w:r>
+        <w:t xml:space="preserve">Verbatim operator mandate:</w:t>
+      </w:r>
+      <w:r>
+        <w:t xml:space="preserve"> </w:t>
+      </w:r>
+      <w:r>
+        <w:rPr>
+          <w:i/>
+          <w:iCs/>
+        </w:rPr>
+        <w:t xml:space="preserve">"Helix QA full websites testing MUST find all such issues, not us! Once we do manual QA we shall not be able to find anything! THIS IS MANDATORY RULE / CONSTRAIN / GOAL to achieve with this and any other project and MUST BE part of the root constitution!"</w:t>
+      </w:r>
+      <w:r>
+        <w:t xml:space="preserve"> </w:t>
+      </w:r>
+      <w:r>
+        <w:t xml:space="preserve">Forensic case study (FACT, 2026-08-08): in one cycle five real defects were found — a health endpoint returning</w:t>
+      </w:r>
+      <w:r>
+        <w:t xml:space="preserve"> </w:t>
+      </w:r>
+      <w:r>
+        <w:rPr>
+          <w:rStyle w:val="VerbatimChar"/>
+        </w:rPr>
+        <w:t xml:space="preserve">{"status":"healthy","components":[]}</w:t>
+      </w:r>
+      <w:r>
+        <w:t xml:space="preserve"> </w:t>
+      </w:r>
+      <w:r>
+        <w:t xml:space="preserve">that was structurally incapable of ever reporting unhealthy; a gateway routing every completion at a port nothing served (HTTP 500 on the product's primary capability); two submodule pins on</w:t>
+      </w:r>
+      <w:r>
+        <w:t xml:space="preserve"> </w:t>
+      </w:r>
+      <w:r>
+        <w:rPr>
+          <w:rStyle w:val="VerbatimChar"/>
+        </w:rPr>
+        <w:t xml:space="preserve">main</w:t>
+      </w:r>
+      <w:r>
+        <w:t xml:space="preserve"> </w:t>
+      </w:r>
+      <w:r>
+        <w:t xml:space="preserve">that upstream answers with</w:t>
+      </w:r>
+      <w:r>
+        <w:t xml:space="preserve"> </w:t>
+      </w:r>
+      <w:r>
+        <w:rPr>
+          <w:rStyle w:val="VerbatimChar"/>
+        </w:rPr>
+        <w:t xml:space="preserve">not our ref</w:t>
+      </w:r>
+      <w:r>
+        <w:t xml:space="preserve">, so no fresh clone could check them out; and two hardware-profiler defects reading a key from a file where it does not exist.</w:t>
+      </w:r>
+      <w:r>
+        <w:t xml:space="preserve"> </w:t>
+      </w:r>
+      <w:r>
+        <w:rPr>
+          <w:b/>
+          <w:bCs/>
+        </w:rPr>
+        <w:t xml:space="preserve">Every one was found by an agent reading source or probing by hand; not one by the automated QA system</w:t>
+      </w:r>
+      <w:r>
+        <w:t xml:space="preserve">, which reported green throughout. The mandate (ALL hold):</w:t>
+      </w:r>
+      <w:r>
+        <w:t xml:space="preserve"> </w:t>
+      </w:r>
+      <w:r>
+        <w:rPr>
+          <w:b/>
+          <w:bCs/>
+        </w:rPr>
+        <w:t xml:space="preserve">(A) the automated QA system is the DISCOVERER, not the confirmer</w:t>
+      </w:r>
+      <w:r>
+        <w:t xml:space="preserve"> </w:t>
+      </w:r>
+      <w:r>
+        <w:t xml:space="preserve">— discovery by a human, an operator's manual pass, an agent reading code, or an end-user report is a FAILURE of the QA system; the finding is still fixed, but the QA gap it exposes is a defect of equal standing and closing only the reported defect is the violation.</w:t>
+      </w:r>
+      <w:r>
+        <w:t xml:space="preserve"> </w:t>
+      </w:r>
+      <w:r>
+        <w:rPr>
+          <w:b/>
+          <w:bCs/>
+        </w:rPr>
+        <w:t xml:space="preserve">(B) manual QA must find NOTHING NEW</w:t>
+      </w:r>
+      <w:r>
+        <w:t xml:space="preserve"> </w:t>
+      </w:r>
+      <w:r>
+        <w:t xml:space="preserve">— by the time manual QA runs (§11.4.185) the automated regime must already have surfaced everything, so manual QA is a CONFIRMATION and sufficiency gate, never the discovery mechanism; the target is explicit and measurable — a manual pass discovering zero previously-unknown defects.</w:t>
+      </w:r>
+      <w:r>
+        <w:t xml:space="preserve"> </w:t>
+      </w:r>
+      <w:r>
+        <w:rPr>
+          <w:b/>
+          <w:bCs/>
+        </w:rPr>
+        <w:t xml:space="preserve">(C) every escape triggers the §11.4.138 loop, widened</w:t>
+      </w:r>
+      <w:r>
+        <w:t xml:space="preserve"> </w:t>
+      </w:r>
+      <w:r>
+        <w:t xml:space="preserve">to EVERY out-of-band channel: systematic-debug the defect (§11.4.102), produce a</w:t>
+      </w:r>
+      <w:r>
+        <w:t xml:space="preserve"> </w:t>
+      </w:r>
+      <w:r>
+        <w:rPr>
+          <w:b/>
+          <w:bCs/>
+        </w:rPr>
+        <w:t xml:space="preserve">coverage-escape audit</w:t>
+      </w:r>
+      <w:r>
+        <w:t xml:space="preserve"> </w:t>
+      </w:r>
+      <w:r>
+        <w:t xml:space="preserve">naming WHY the regime missed it cited to the specific missing check / unexercised path / absent assertion (never "we didn't think of it"), register a new or strengthened automated check that WOULD have caught it into the standing regime (§11.4.135) with a §11.4.115 RED capturing the escaped defect, and commit the audit as captured evidence.</w:t>
+      </w:r>
+      <w:r>
+        <w:t xml:space="preserve"> </w:t>
+      </w:r>
+      <w:r>
+        <w:rPr>
+          <w:b/>
+          <w:bCs/>
+        </w:rPr>
+        <w:t xml:space="preserve">(D) coverage is measured by what the regime can CATCH, not what it runs</w:t>
+      </w:r>
+      <w:r>
+        <w:t xml:space="preserve"> </w:t>
+      </w:r>
+      <w:r>
+        <w:t xml:space="preserve">— every surface falsifiable per §1.1 (a check whose paired mutation does not make it fail is decoration), exercising real user-reachable paths end-to-end (§11.4.98 / §11.4.143 / §11.4.136 / §11.4.158 / §11.4.159 / §11.4.160).</w:t>
+      </w:r>
+      <w:r>
+        <w:t xml:space="preserve"> </w:t>
+      </w:r>
+      <w:r>
+        <w:rPr>
+          <w:b/>
+          <w:bCs/>
+        </w:rPr>
+        <w:t xml:space="preserve">(E) directional and measured</w:t>
+      </w:r>
+      <w:r>
+        <w:t xml:space="preserve"> </w:t>
+      </w:r>
+      <w:r>
+        <w:t xml:space="preserve">— track the discovery-channel split (automated vs out-of-band) and drive out-of-band toward zero; honest boundary (§11.4.6): this does NOT claim a regime can be provably complete (§11.4.118) and does NOT license closing an escape by narrowing the definition of "defect". Composes §11.4.27 / §11.4.138 (trigger set widened) / §11.4.185 (manual QA becomes confirmation, never discovery) / §11.4.118 / §11.4.135 / §11.4.115 / §11.4.98 / §11.4.136 / §11.4.143 / §11.4.158 / §11.4.159 / §11.4.160 / §11.4.102 / §11.4.6 / §1.1. Classification: universal (§11.4.17) — the consuming project supplies its QA system, surface inventory, and discovery-channel ledger per §11.4.35. Propagation gate</w:t>
+      </w:r>
+      <w:r>
+        <w:t xml:space="preserve"> </w:t>
+      </w:r>
+      <w:r>
+        <w:rPr>
+          <w:rStyle w:val="VerbatimChar"/>
+        </w:rPr>
+        <w:t xml:space="preserve">CM-COVENANT-114-238-PROPAGATION</w:t>
+      </w:r>
+      <w:r>
+        <w:t xml:space="preserve"> </w:t>
+      </w:r>
+      <w:r>
+        <w:t xml:space="preserve">(literal</w:t>
+      </w:r>
+      <w:r>
+        <w:t xml:space="preserve"> </w:t>
+      </w:r>
+      <w:r>
+        <w:rPr>
+          <w:rStyle w:val="VerbatimChar"/>
+        </w:rPr>
+        <w:t xml:space="preserve">11.4.238</w:t>
+      </w:r>
+      <w:r>
+        <w:t xml:space="preserve">) + recommended gates</w:t>
+      </w:r>
+      <w:r>
+        <w:t xml:space="preserve"> </w:t>
+      </w:r>
+      <w:r>
+        <w:rPr>
+          <w:rStyle w:val="VerbatimChar"/>
+        </w:rPr>
+        <w:t xml:space="preserve">CM-QA-IS-THE-DISCOVERER</w:t>
+      </w:r>
+      <w:r>
+        <w:t xml:space="preserve"> </w:t>
+      </w:r>
+      <w:r>
+        <w:t xml:space="preserve">/</w:t>
+      </w:r>
+      <w:r>
+        <w:t xml:space="preserve"> </w:t>
+      </w:r>
+      <w:r>
+        <w:rPr>
+          <w:rStyle w:val="VerbatimChar"/>
+        </w:rPr>
+        <w:t xml:space="preserve">CM-MANUAL-QA-FINDS-NOTHING-NEW</w:t>
+      </w:r>
+      <w:r>
+        <w:t xml:space="preserve"> </w:t>
+      </w:r>
+      <w:r>
+        <w:t xml:space="preserve">+ paired §1.1 mutation (gate-code = separate work item, NOT claimed shipped §11.4.6/§11.4.227).</w:t>
+      </w:r>
+    </w:p>
+    <w:p>
+      <w:pPr>
+        <w:pStyle w:val="BodyText"/>
+      </w:pPr>
+      <w:r>
+        <w:rPr>
+          <w:b/>
+          <w:bCs/>
+        </w:rPr>
+        <w:t xml:space="preserve">Canonical authority:</w:t>
+      </w:r>
+      <w:r>
+        <w:t xml:space="preserve"> </w:t>
+      </w:r>
+      <w:r>
+        <w:t xml:space="preserve">constitution submodule</w:t>
+      </w:r>
+      <w:r>
+        <w:t xml:space="preserve"> </w:t>
+      </w:r>
+      <w:hyperlink r:id="rId69">
+        <w:r>
+          <w:rPr>
+            <w:rStyle w:val="VerbatimChar"/>
+          </w:rPr>
+          <w:t xml:space="preserve">Constitution.md</w:t>
+        </w:r>
+      </w:hyperlink>
+      <w:r>
+        <w:t xml:space="preserve"> </w:t>
+      </w:r>
+      <w:r>
+        <w:t xml:space="preserve">§11.4.238. Non-compliance is a release blocker. No escape hatch — no</w:t>
+      </w:r>
+      <w:r>
+        <w:t xml:space="preserve"> </w:t>
+      </w:r>
+      <w:r>
+        <w:rPr>
+          <w:rStyle w:val="VerbatimChar"/>
+        </w:rPr>
+        <w:t xml:space="preserve">--manual-qa-may-discover</w:t>
+      </w:r>
+      <w:r>
+        <w:t xml:space="preserve">,</w:t>
+      </w:r>
+      <w:r>
+        <w:t xml:space="preserve"> </w:t>
+      </w:r>
+      <w:r>
+        <w:rPr>
+          <w:rStyle w:val="VerbatimChar"/>
+        </w:rPr>
+        <w:t xml:space="preserve">--skip-coverage-escape-audit</w:t>
+      </w:r>
+      <w:r>
+        <w:t xml:space="preserve">,</w:t>
+      </w:r>
+      <w:r>
+        <w:t xml:space="preserve"> </w:t>
+      </w:r>
+      <w:r>
+        <w:rPr>
+          <w:rStyle w:val="VerbatimChar"/>
+        </w:rPr>
+        <w:t xml:space="preserve">--found-by-human-is-fine</w:t>
+      </w:r>
+      <w:r>
+        <w:t xml:space="preserve">,</w:t>
+      </w:r>
+      <w:r>
+        <w:t xml:space="preserve"> </w:t>
+      </w:r>
+      <w:r>
+        <w:rPr>
+          <w:rStyle w:val="VerbatimChar"/>
+        </w:rPr>
+        <w:t xml:space="preserve">--close-escape-without-new-check</w:t>
+      </w:r>
+      <w:r>
+        <w:t xml:space="preserve">,</w:t>
+      </w:r>
+      <w:r>
+        <w:t xml:space="preserve"> </w:t>
+      </w:r>
+      <w:r>
+        <w:rPr>
+          <w:rStyle w:val="VerbatimChar"/>
+        </w:rPr>
+        <w:t xml:space="preserve">--qa-green-is-enough</w:t>
+      </w:r>
+      <w:r>
+        <w:t xml:space="preserve">,</w:t>
+      </w:r>
+      <w:r>
+        <w:t xml:space="preserve"> </w:t>
+      </w:r>
+      <w:r>
+        <w:rPr>
+          <w:rStyle w:val="VerbatimChar"/>
+        </w:rPr>
+        <w:t xml:space="preserve">--discovery-channel-not-tracked</w:t>
       </w:r>
       <w:r>
         <w:t xml:space="preserve"> </w:t>

</xml_diff>